<commit_message>
Further refine project descriptions and update CV
</commit_message>
<xml_diff>
--- a/Ovsiannykov_CV.docx
+++ b/Ovsiannykov_CV.docx
@@ -358,7 +358,26 @@
           <w:sz w:val="20"/>
           <w:szCs w:val="20"/>
         </w:rPr>
-        <w:t xml:space="preserve">Односторінковий застосунок для конвертації PDF у зображення, видалення ватермарок і штампів, експорту в ZIP / PDF / PPTX. Вся обробка — локально в браузері, без передачі файлів на сервер.</w:t>
+        <w:t xml:space="preserve">Односторінковий застосунок для конвертації PDF </w:t>
+      </w:r>
+      <w:r>
+        <w:rPr>
+          <w:rFonts w:ascii="Arial" w:hAnsi="Arial" w:eastAsia="Arial" w:cs="Arial"/>
+          <w:color w:val="555555"/>
+          <w:sz w:val="20"/>
+          <w:szCs w:val="20"/>
+          <w:lang w:val="undefined"/>
+        </w:rPr>
+        <w:t xml:space="preserve">презентацій NotebookLM</w:t>
+      </w:r>
+      <w:r>
+        <w:rPr>
+          <w:rFonts w:ascii="Arial" w:hAnsi="Arial" w:eastAsia="Arial" w:cs="Arial"/>
+          <w:color w:val="555555"/>
+          <w:sz w:val="20"/>
+          <w:szCs w:val="20"/>
+        </w:rPr>
+        <w:t xml:space="preserve"> у зображення, видалення ватермарок і штампів, експорту в ZIP / PDF / PPTX. Вся обробка — локально в браузері, без передачі файлів на сервер.</w:t>
       </w:r>
       <w:r/>
     </w:p>
@@ -716,7 +735,6 @@
           <w:color w:val="555555"/>
           <w:sz w:val="20"/>
           <w:szCs w:val="20"/>
-          <w:lang w:val="undefined"/>
         </w:rPr>
         <w:t xml:space="preserve">Утиліта для підвищення зручності роботи, яка озвучує поточну розкладку клавіатури при перемиканні (наприклад, “укр” / “ен”), допомагаючи уникати помилок при наборі тексту. Підтримує незалежне керування гучністю та збереження налаштувань.</w:t>
       </w:r>
@@ -726,7 +744,6 @@
           <w:color w:val="555555"/>
           <w:sz w:val="20"/>
           <w:szCs w:val="20"/>
-          <w:lang w:val="undefined" w:bidi="undefined"/>
         </w:rPr>
       </w:r>
       <w:r>
@@ -735,7 +752,7 @@
           <w:color w:val="555555"/>
           <w:sz w:val="20"/>
           <w:szCs w:val="20"/>
-          <w:lang w:val="undefined"/>
+          <w14:ligatures w14:val="none"/>
         </w:rPr>
       </w:r>
     </w:p>
@@ -1644,7 +1661,6 @@
         </w:rPr>
         <w:t xml:space="preserve">описаними вище</w:t>
       </w:r>
-      <w:r/>
       <w:r>
         <w:rPr>
           <w:rFonts w:ascii="Arial" w:hAnsi="Arial" w:eastAsia="Arial" w:cs="Arial"/>

</xml_diff>